<commit_message>
fix(evals): keep glp-03's study director signature gap inside its planted section
The held-out glp-03 had a separate Protocol Approval section saying the
study director signs the protocol once designated, a 58.120(a)(11) gap
outside any gold row, so a correct reviewer scored a false positive there.
The sponsor approval and the deferred signature now sit in the planted
Study Director section, and Protocol Approval is gone.

ide-02 now states the overall duration of the investigation (812.25(a)),
and glp-02 documents the method of fabrication of both articles
(58.105(a)) in its unplanted Test and Control Articles section. Gold rows
are unchanged.

Co-Authored-By: Claude Opus 5.5 <noreply@anthropic.com>
</commit_message>
<xml_diff>
--- a/evals/review/protocols/glp-03.docx
+++ b/evals/review/protocols/glp-03.docx
@@ -64,7 +64,7 @@
     </w:p>
     <w:p>
       <w:r>
-        <w:t xml:space="preserve">Dosing begins under the supervision of the senior technician. Testing facility management will designate a study director once the in-life phase is complete.</w:t>
+        <w:t xml:space="preserve">The sponsor approved this protocol on 12 January 2026. Dosing begins under the supervision of the senior technician. Testing facility management will designate a study director once the in-life phase is complete, and the study director signs and dates the protocol at that time.</w:t>
       </w:r>
     </w:p>
     <w:p>
@@ -182,19 +182,6 @@
     <w:p>
       <w:r>
         <w:t xml:space="preserve">Maternal body weights and fetal weights are compared between each dose group and the control with analysis of variance followed by Dunnett's test, with the litter as the unit of analysis. Fetal malformation and variation incidences are compared with Fisher's exact test on litter counts. Both use a two-sided significance level of 0.05.</w:t>
-      </w:r>
-    </w:p>
-    <w:p>
-      <w:pPr>
-        <w:pStyle w:val="Heading1"/>
-      </w:pPr>
-      <w:r>
-        <w:t xml:space="preserve">Protocol Approval</w:t>
-      </w:r>
-    </w:p>
-    <w:p>
-      <w:r>
-        <w:t xml:space="preserve">The sponsor approved this protocol on 12 January 2026. The study director signs and dates the protocol when designated.</w:t>
       </w:r>
     </w:p>
     <w:p>

</xml_diff>